<commit_message>
Update research paper and add the IOMP presentation
The rendered product film (MP4) is kept out of the repository.

Co-Authored-By: Claude Opus 5.5 <noreply@anthropic.com>
</commit_message>
<xml_diff>
--- a/docs/paper/PlacementIQ_Enterprise_Research_Paper.docx
+++ b/docs/paper/PlacementIQ_Enterprise_Research_Paper.docx
@@ -18,19 +18,20 @@
     <w:tbl>
       <w:tblPr>
         <w:tblW w:w="10440" w:type="dxa"/>
+        <w:jc w:val="center"/>
         <w:tblBorders>
-          <w:top w:val="none" w:sz="0" w:space="0" w:color="FFFFFF"/>
-          <w:left w:val="none" w:sz="0" w:space="0" w:color="FFFFFF"/>
-          <w:bottom w:val="none" w:sz="0" w:space="0" w:color="FFFFFF"/>
-          <w:right w:val="none" w:sz="0" w:space="0" w:color="FFFFFF"/>
-          <w:insideH w:val="none" w:sz="0" w:space="0" w:color="FFFFFF"/>
-          <w:insideV w:val="none" w:sz="0" w:space="0" w:color="FFFFFF"/>
+          <w:top w:val="nil"/>
+          <w:left w:val="nil"/>
+          <w:bottom w:val="nil"/>
+          <w:right w:val="nil"/>
+          <w:insideH w:val="nil"/>
+          <w:insideV w:val="nil"/>
         </w:tblBorders>
+        <w:tblLayout w:type="fixed"/>
         <w:tblCellMar>
-          <w:left w:w="10" w:type="dxa"/>
-          <w:right w:w="10" w:type="dxa"/>
+          <w:left w:w="40" w:type="dxa"/>
+          <w:right w:w="40" w:type="dxa"/>
         </w:tblCellMar>
-        <w:tblLook w:val="04A0" w:firstRow="1" w:lastRow="0" w:firstColumn="1" w:lastColumn="0" w:noHBand="0" w:noVBand="1"/>
       </w:tblPr>
       <w:tblGrid>
         <w:gridCol w:w="1740"/>
@@ -41,25 +42,17 @@
         <w:gridCol w:w="1740"/>
       </w:tblGrid>
       <w:tr>
-        <w:tblPrEx>
-          <w:tblCellMar>
-            <w:top w:w="0" w:type="dxa"/>
-            <w:bottom w:w="0" w:type="dxa"/>
-          </w:tblCellMar>
-        </w:tblPrEx>
+        <w:trPr>
+          <w:cantSplit/>
+        </w:trPr>
         <w:tc>
           <w:tcPr>
             <w:tcW w:w="3480" w:type="dxa"/>
             <w:gridSpan w:val="2"/>
-            <w:tcBorders>
-              <w:top w:val="none" w:sz="0" w:space="0" w:color="FFFFFF"/>
-              <w:left w:val="none" w:sz="0" w:space="0" w:color="FFFFFF"/>
-              <w:bottom w:val="none" w:sz="0" w:space="0" w:color="FFFFFF"/>
-              <w:right w:val="none" w:sz="0" w:space="0" w:color="FFFFFF"/>
-            </w:tcBorders>
-          </w:tcPr>
-          <w:p>
-            <w:pPr>
+          </w:tcPr>
+          <w:p>
+            <w:pPr>
+              <w:spacing w:before="0" w:after="0" w:line="240" w:lineRule="auto"/>
               <w:jc w:val="center"/>
             </w:pPr>
             <w:r>
@@ -67,25 +60,26 @@
                 <w:sz w:val="22"/>
                 <w:szCs w:val="22"/>
               </w:rPr>
-              <w:t>Shaganti Vivek Goud</w:t>
-            </w:r>
-          </w:p>
-          <w:p>
-            <w:pPr>
+              <w:t xml:space="preserve">Shaganti Vivek Goud</w:t>
+            </w:r>
+          </w:p>
+          <w:p>
+            <w:pPr>
+              <w:spacing w:before="0" w:after="0" w:line="240" w:lineRule="auto"/>
               <w:jc w:val="center"/>
             </w:pPr>
             <w:r>
               <w:rPr>
                 <w:i/>
-                <w:iCs/>
                 <w:sz w:val="18"/>
                 <w:szCs w:val="18"/>
               </w:rPr>
-              <w:t>Dept. of Computer Science and Engineering</w:t>
-            </w:r>
-          </w:p>
-          <w:p>
-            <w:pPr>
+              <w:t xml:space="preserve">Dept. of Computer Science and Engineering</w:t>
+            </w:r>
+          </w:p>
+          <w:p>
+            <w:pPr>
+              <w:spacing w:before="0" w:after="0" w:line="240" w:lineRule="auto"/>
               <w:jc w:val="center"/>
             </w:pPr>
             <w:r>
@@ -93,11 +87,12 @@
                 <w:sz w:val="18"/>
                 <w:szCs w:val="18"/>
               </w:rPr>
-              <w:t>Anurag University</w:t>
-            </w:r>
-          </w:p>
-          <w:p>
-            <w:pPr>
+              <w:t xml:space="preserve">Anurag University</w:t>
+            </w:r>
+          </w:p>
+          <w:p>
+            <w:pPr>
+              <w:spacing w:before="0" w:after="0" w:line="240" w:lineRule="auto"/>
               <w:jc w:val="center"/>
             </w:pPr>
             <w:r>
@@ -105,7 +100,20 @@
                 <w:sz w:val="18"/>
                 <w:szCs w:val="18"/>
               </w:rPr>
-              <w:t>Hyderabad, India | 23eg105f59@anurag.edu.in</w:t>
+              <w:t xml:space="preserve">Hyderabad, India</w:t>
+            </w:r>
+          </w:p>
+          <w:p>
+            <w:pPr>
+              <w:spacing w:before="0" w:after="0" w:line="240" w:lineRule="auto"/>
+              <w:jc w:val="center"/>
+            </w:pPr>
+            <w:r>
+              <w:rPr>
+                <w:sz w:val="18"/>
+                <w:szCs w:val="18"/>
+              </w:rPr>
+              <w:t xml:space="preserve">23eg105f59@anurag.edu.in</w:t>
             </w:r>
           </w:p>
         </w:tc>
@@ -113,15 +121,10 @@
           <w:tcPr>
             <w:tcW w:w="3480" w:type="dxa"/>
             <w:gridSpan w:val="2"/>
-            <w:tcBorders>
-              <w:top w:val="none" w:sz="0" w:space="0" w:color="FFFFFF"/>
-              <w:left w:val="none" w:sz="0" w:space="0" w:color="FFFFFF"/>
-              <w:bottom w:val="none" w:sz="0" w:space="0" w:color="FFFFFF"/>
-              <w:right w:val="none" w:sz="0" w:space="0" w:color="FFFFFF"/>
-            </w:tcBorders>
-          </w:tcPr>
-          <w:p>
-            <w:pPr>
+          </w:tcPr>
+          <w:p>
+            <w:pPr>
+              <w:spacing w:before="0" w:after="0" w:line="240" w:lineRule="auto"/>
               <w:jc w:val="center"/>
             </w:pPr>
             <w:r>
@@ -129,25 +132,26 @@
                 <w:sz w:val="22"/>
                 <w:szCs w:val="22"/>
               </w:rPr>
-              <w:t>Puram Preethi</w:t>
-            </w:r>
-          </w:p>
-          <w:p>
-            <w:pPr>
+              <w:t xml:space="preserve">Puram Preethi</w:t>
+            </w:r>
+          </w:p>
+          <w:p>
+            <w:pPr>
+              <w:spacing w:before="0" w:after="0" w:line="240" w:lineRule="auto"/>
               <w:jc w:val="center"/>
             </w:pPr>
             <w:r>
               <w:rPr>
                 <w:i/>
-                <w:iCs/>
                 <w:sz w:val="18"/>
                 <w:szCs w:val="18"/>
               </w:rPr>
-              <w:t>Dept. of Computer Science and Engineering</w:t>
-            </w:r>
-          </w:p>
-          <w:p>
-            <w:pPr>
+              <w:t xml:space="preserve">Dept. of Computer Science and Engineering</w:t>
+            </w:r>
+          </w:p>
+          <w:p>
+            <w:pPr>
+              <w:spacing w:before="0" w:after="0" w:line="240" w:lineRule="auto"/>
               <w:jc w:val="center"/>
             </w:pPr>
             <w:r>
@@ -155,11 +159,12 @@
                 <w:sz w:val="18"/>
                 <w:szCs w:val="18"/>
               </w:rPr>
-              <w:t>Anurag University</w:t>
-            </w:r>
-          </w:p>
-          <w:p>
-            <w:pPr>
+              <w:t xml:space="preserve">Anurag University</w:t>
+            </w:r>
+          </w:p>
+          <w:p>
+            <w:pPr>
+              <w:spacing w:before="0" w:after="0" w:line="240" w:lineRule="auto"/>
               <w:jc w:val="center"/>
             </w:pPr>
             <w:r>
@@ -167,7 +172,20 @@
                 <w:sz w:val="18"/>
                 <w:szCs w:val="18"/>
               </w:rPr>
-              <w:t>Hyderabad, India | 23eg105f52@anurag.edu.in</w:t>
+              <w:t xml:space="preserve">Hyderabad, India</w:t>
+            </w:r>
+          </w:p>
+          <w:p>
+            <w:pPr>
+              <w:spacing w:before="0" w:after="0" w:line="240" w:lineRule="auto"/>
+              <w:jc w:val="center"/>
+            </w:pPr>
+            <w:r>
+              <w:rPr>
+                <w:sz w:val="18"/>
+                <w:szCs w:val="18"/>
+              </w:rPr>
+              <w:t xml:space="preserve">23eg105f52@anurag.edu.in</w:t>
             </w:r>
           </w:p>
         </w:tc>
@@ -175,15 +193,10 @@
           <w:tcPr>
             <w:tcW w:w="3480" w:type="dxa"/>
             <w:gridSpan w:val="2"/>
-            <w:tcBorders>
-              <w:top w:val="none" w:sz="0" w:space="0" w:color="FFFFFF"/>
-              <w:left w:val="none" w:sz="0" w:space="0" w:color="FFFFFF"/>
-              <w:bottom w:val="none" w:sz="0" w:space="0" w:color="FFFFFF"/>
-              <w:right w:val="none" w:sz="0" w:space="0" w:color="FFFFFF"/>
-            </w:tcBorders>
-          </w:tcPr>
-          <w:p>
-            <w:pPr>
+          </w:tcPr>
+          <w:p>
+            <w:pPr>
+              <w:spacing w:before="0" w:after="0" w:line="240" w:lineRule="auto"/>
               <w:jc w:val="center"/>
             </w:pPr>
             <w:r>
@@ -191,25 +204,26 @@
                 <w:sz w:val="22"/>
                 <w:szCs w:val="22"/>
               </w:rPr>
-              <w:t>Akshaya Reddy</w:t>
-            </w:r>
-          </w:p>
-          <w:p>
-            <w:pPr>
+              <w:t xml:space="preserve">Akshaya Reddy</w:t>
+            </w:r>
+          </w:p>
+          <w:p>
+            <w:pPr>
+              <w:spacing w:before="0" w:after="0" w:line="240" w:lineRule="auto"/>
               <w:jc w:val="center"/>
             </w:pPr>
             <w:r>
               <w:rPr>
                 <w:i/>
-                <w:iCs/>
                 <w:sz w:val="18"/>
                 <w:szCs w:val="18"/>
               </w:rPr>
-              <w:t>Dept. of Computer Science and Engineering</w:t>
-            </w:r>
-          </w:p>
-          <w:p>
-            <w:pPr>
+              <w:t xml:space="preserve">Dept. of Computer Science and Engineering</w:t>
+            </w:r>
+          </w:p>
+          <w:p>
+            <w:pPr>
+              <w:spacing w:before="0" w:after="0" w:line="240" w:lineRule="auto"/>
               <w:jc w:val="center"/>
             </w:pPr>
             <w:r>
@@ -217,11 +231,12 @@
                 <w:sz w:val="18"/>
                 <w:szCs w:val="18"/>
               </w:rPr>
-              <w:t>Anurag University</w:t>
-            </w:r>
-          </w:p>
-          <w:p>
-            <w:pPr>
+              <w:t xml:space="preserve">Anurag University</w:t>
+            </w:r>
+          </w:p>
+          <w:p>
+            <w:pPr>
+              <w:spacing w:before="0" w:after="0" w:line="240" w:lineRule="auto"/>
               <w:jc w:val="center"/>
             </w:pPr>
             <w:r>
@@ -229,31 +244,47 @@
                 <w:sz w:val="18"/>
                 <w:szCs w:val="18"/>
               </w:rPr>
-              <w:t>Hyderabad, India | 23eg105f03@anurag.edu.in</w:t>
+              <w:t xml:space="preserve">Hyderabad, India</w:t>
+            </w:r>
+          </w:p>
+          <w:p>
+            <w:pPr>
+              <w:spacing w:before="0" w:after="0" w:line="240" w:lineRule="auto"/>
+              <w:jc w:val="center"/>
+            </w:pPr>
+            <w:r>
+              <w:rPr>
+                <w:sz w:val="18"/>
+                <w:szCs w:val="18"/>
+              </w:rPr>
+              <w:t xml:space="preserve">23eg105f03@anurag.edu.in</w:t>
             </w:r>
           </w:p>
         </w:tc>
       </w:tr>
       <w:tr>
-        <w:tblPrEx>
-          <w:tblCellMar>
-            <w:top w:w="0" w:type="dxa"/>
-            <w:bottom w:w="0" w:type="dxa"/>
-          </w:tblCellMar>
-        </w:tblPrEx>
+        <w:trPr>
+          <w:cantSplit/>
+        </w:trPr>
         <w:tc>
           <w:tcPr>
             <w:tcW w:w="1740" w:type="dxa"/>
-            <w:gridSpan w:val="1"/>
-            <w:tcBorders>
-              <w:top w:val="none" w:sz="0" w:space="0" w:color="FFFFFF"/>
-              <w:left w:val="none" w:sz="0" w:space="0" w:color="FFFFFF"/>
-              <w:bottom w:val="none" w:sz="0" w:space="0" w:color="FFFFFF"/>
-              <w:right w:val="none" w:sz="0" w:space="0" w:color="FFFFFF"/>
-            </w:tcBorders>
-          </w:tcPr>
-          <w:p>
-            <w:pPr>
+          </w:tcPr>
+          <w:p>
+            <w:pPr>
+              <w:spacing w:before="0" w:after="0" w:line="240" w:lineRule="auto"/>
+              <w:jc w:val="center"/>
+            </w:pPr>
+          </w:p>
+        </w:tc>
+        <w:tc>
+          <w:tcPr>
+            <w:tcW w:w="3480" w:type="dxa"/>
+            <w:gridSpan w:val="2"/>
+          </w:tcPr>
+          <w:p>
+            <w:pPr>
+              <w:spacing w:before="200" w:after="0" w:line="240" w:lineRule="auto"/>
               <w:jc w:val="center"/>
             </w:pPr>
             <w:r>
@@ -261,7 +292,60 @@
                 <w:sz w:val="22"/>
                 <w:szCs w:val="22"/>
               </w:rPr>
-              <w:t/>
+              <w:t xml:space="preserve">Bandari Laxmisri</w:t>
+            </w:r>
+          </w:p>
+          <w:p>
+            <w:pPr>
+              <w:spacing w:before="0" w:after="0" w:line="240" w:lineRule="auto"/>
+              <w:jc w:val="center"/>
+            </w:pPr>
+            <w:r>
+              <w:rPr>
+                <w:i/>
+                <w:sz w:val="18"/>
+                <w:szCs w:val="18"/>
+              </w:rPr>
+              <w:t xml:space="preserve">Dept. of Computer Science and Engineering</w:t>
+            </w:r>
+          </w:p>
+          <w:p>
+            <w:pPr>
+              <w:spacing w:before="0" w:after="0" w:line="240" w:lineRule="auto"/>
+              <w:jc w:val="center"/>
+            </w:pPr>
+            <w:r>
+              <w:rPr>
+                <w:sz w:val="18"/>
+                <w:szCs w:val="18"/>
+              </w:rPr>
+              <w:t xml:space="preserve">Anurag University</w:t>
+            </w:r>
+          </w:p>
+          <w:p>
+            <w:pPr>
+              <w:spacing w:before="0" w:after="0" w:line="240" w:lineRule="auto"/>
+              <w:jc w:val="center"/>
+            </w:pPr>
+            <w:r>
+              <w:rPr>
+                <w:sz w:val="18"/>
+                <w:szCs w:val="18"/>
+              </w:rPr>
+              <w:t xml:space="preserve">Hyderabad, India</w:t>
+            </w:r>
+          </w:p>
+          <w:p>
+            <w:pPr>
+              <w:spacing w:before="0" w:after="0" w:line="240" w:lineRule="auto"/>
+              <w:jc w:val="center"/>
+            </w:pPr>
+            <w:r>
+              <w:rPr>
+                <w:sz w:val="18"/>
+                <w:szCs w:val="18"/>
+              </w:rPr>
+              <w:t xml:space="preserve">23eg105f09@anurag.edu.in</w:t>
             </w:r>
           </w:p>
         </w:tc>
@@ -269,15 +353,10 @@
           <w:tcPr>
             <w:tcW w:w="3480" w:type="dxa"/>
             <w:gridSpan w:val="2"/>
-            <w:tcBorders>
-              <w:top w:val="none" w:sz="0" w:space="0" w:color="FFFFFF"/>
-              <w:left w:val="none" w:sz="0" w:space="0" w:color="FFFFFF"/>
-              <w:bottom w:val="none" w:sz="0" w:space="0" w:color="FFFFFF"/>
-              <w:right w:val="none" w:sz="0" w:space="0" w:color="FFFFFF"/>
-            </w:tcBorders>
-          </w:tcPr>
-          <w:p>
-            <w:pPr>
+          </w:tcPr>
+          <w:p>
+            <w:pPr>
+              <w:spacing w:before="200" w:after="0" w:line="240" w:lineRule="auto"/>
               <w:jc w:val="center"/>
             </w:pPr>
             <w:r>
@@ -285,37 +364,40 @@
                 <w:sz w:val="22"/>
                 <w:szCs w:val="22"/>
               </w:rPr>
-              <w:t>Bandari Laxmisri</w:t>
-            </w:r>
-          </w:p>
-          <w:p>
-            <w:pPr>
+              <w:t xml:space="preserve">Dr. Kamalakar Ramineni</w:t>
+            </w:r>
+          </w:p>
+          <w:p>
+            <w:pPr>
+              <w:spacing w:before="0" w:after="0" w:line="240" w:lineRule="auto"/>
               <w:jc w:val="center"/>
             </w:pPr>
             <w:r>
               <w:rPr>
                 <w:i/>
-                <w:iCs/>
                 <w:sz w:val="18"/>
                 <w:szCs w:val="18"/>
               </w:rPr>
-              <w:t>Dept. of Computer Science and Engineering</w:t>
-            </w:r>
-          </w:p>
-          <w:p>
-            <w:pPr>
-              <w:jc w:val="center"/>
-            </w:pPr>
-            <w:r>
-              <w:rPr>
+              <w:t xml:space="preserve">Assistant Professor</w:t>
+            </w:r>
+          </w:p>
+          <w:p>
+            <w:pPr>
+              <w:spacing w:before="0" w:after="0" w:line="240" w:lineRule="auto"/>
+              <w:jc w:val="center"/>
+            </w:pPr>
+            <w:r>
+              <w:rPr>
+                <w:i/>
                 <w:sz w:val="18"/>
                 <w:szCs w:val="18"/>
               </w:rPr>
-              <w:t>Anurag University</w:t>
-            </w:r>
-          </w:p>
-          <w:p>
-            <w:pPr>
+              <w:t xml:space="preserve">Dept. of Computer Science and Engineering</w:t>
+            </w:r>
+          </w:p>
+          <w:p>
+            <w:pPr>
+              <w:spacing w:before="0" w:after="0" w:line="240" w:lineRule="auto"/>
               <w:jc w:val="center"/>
             </w:pPr>
             <w:r>
@@ -323,49 +405,25 @@
                 <w:sz w:val="18"/>
                 <w:szCs w:val="18"/>
               </w:rPr>
-              <w:t>Hyderabad, India | 23eg105f09@anurag.edu.in</w:t>
-            </w:r>
-          </w:p>
-        </w:tc>
-        <w:tc>
-          <w:tcPr>
-            <w:tcW w:w="3480" w:type="dxa"/>
-            <w:gridSpan w:val="2"/>
-            <w:tcBorders>
-              <w:top w:val="none" w:sz="0" w:space="0" w:color="FFFFFF"/>
-              <w:left w:val="none" w:sz="0" w:space="0" w:color="FFFFFF"/>
-              <w:bottom w:val="none" w:sz="0" w:space="0" w:color="FFFFFF"/>
-              <w:right w:val="none" w:sz="0" w:space="0" w:color="FFFFFF"/>
-            </w:tcBorders>
-          </w:tcPr>
-          <w:p>
-            <w:pPr>
-              <w:jc w:val="center"/>
-            </w:pPr>
-            <w:r>
-              <w:rPr>
-                <w:sz w:val="22"/>
-                <w:szCs w:val="22"/>
-              </w:rPr>
-              <w:t>Dr. Kamalakar Ramineni</w:t>
-            </w:r>
-          </w:p>
-          <w:p>
-            <w:pPr>
-              <w:jc w:val="center"/>
-            </w:pPr>
-            <w:r>
-              <w:rPr>
-                <w:i/>
-                <w:iCs/>
+              <w:t xml:space="preserve">Anurag University</w:t>
+            </w:r>
+          </w:p>
+          <w:p>
+            <w:pPr>
+              <w:spacing w:before="0" w:after="0" w:line="240" w:lineRule="auto"/>
+              <w:jc w:val="center"/>
+            </w:pPr>
+            <w:r>
+              <w:rPr>
                 <w:sz w:val="18"/>
                 <w:szCs w:val="18"/>
               </w:rPr>
-              <w:t>Assistant Professor, Dept. of Computer Science and Engineering</w:t>
-            </w:r>
-          </w:p>
-          <w:p>
-            <w:pPr>
+              <w:t xml:space="preserve">Hyderabad, India</w:t>
+            </w:r>
+          </w:p>
+          <w:p>
+            <w:pPr>
+              <w:spacing w:before="0" w:after="0" w:line="240" w:lineRule="auto"/>
               <w:jc w:val="center"/>
             </w:pPr>
             <w:r>
@@ -373,44 +431,19 @@
                 <w:sz w:val="18"/>
                 <w:szCs w:val="18"/>
               </w:rPr>
-              <w:t>Anurag University</w:t>
-            </w:r>
-          </w:p>
-          <w:p>
-            <w:pPr>
-              <w:jc w:val="center"/>
-            </w:pPr>
-            <w:r>
-              <w:rPr>
-                <w:sz w:val="18"/>
-                <w:szCs w:val="18"/>
-              </w:rPr>
-              <w:t>Hyderabad, India</w:t>
+              <w:t xml:space="preserve">kamalakar.cse@anurag.edu.in</w:t>
             </w:r>
           </w:p>
         </w:tc>
         <w:tc>
           <w:tcPr>
             <w:tcW w:w="1740" w:type="dxa"/>
-            <w:gridSpan w:val="1"/>
-            <w:tcBorders>
-              <w:top w:val="none" w:sz="0" w:space="0" w:color="FFFFFF"/>
-              <w:left w:val="none" w:sz="0" w:space="0" w:color="FFFFFF"/>
-              <w:bottom w:val="none" w:sz="0" w:space="0" w:color="FFFFFF"/>
-              <w:right w:val="none" w:sz="0" w:space="0" w:color="FFFFFF"/>
-            </w:tcBorders>
-          </w:tcPr>
-          <w:p>
-            <w:pPr>
-              <w:jc w:val="center"/>
-            </w:pPr>
-            <w:r>
-              <w:rPr>
-                <w:sz w:val="22"/>
-                <w:szCs w:val="22"/>
-              </w:rPr>
-              <w:t/>
-            </w:r>
+          </w:tcPr>
+          <w:p>
+            <w:pPr>
+              <w:spacing w:before="0" w:after="0" w:line="240" w:lineRule="auto"/>
+              <w:jc w:val="center"/>
+            </w:pPr>
           </w:p>
         </w:tc>
       </w:tr>
@@ -909,6 +942,16 @@
           <w:bCs/>
         </w:rPr>
         <w:t>Comparative Summary of Related Work</w:t>
+      </w:r>
+    </w:p>
+    <w:p>
+      <w:pPr>
+        <w:spacing w:after="100"/>
+        <w:ind w:firstLine="202"/>
+        <w:jc w:val="both"/>
+      </w:pPr>
+      <w:r>
+        <w:t>Table I compares representative studies by year, method, data and main limitation. Most of them predict a single placement outcome, recommend careers or learning in general, or rank candidates for recruiters; none of them tells a student, for each visiting company, whether they are eligible, why not, and what to improve.</w:t>
       </w:r>
     </w:p>
     <w:p>
@@ -973,6 +1016,7 @@
           </w:tblCellMar>
         </w:tblPrEx>
         <w:trPr>
+          <w:cantSplit/>
           <w:tblHeader/>
         </w:trPr>
         <w:tc>
@@ -984,16 +1028,17 @@
               <w:bottom w:val="single" w:sz="4" w:space="0" w:color="000000"/>
               <w:right w:val="single" w:sz="4" w:space="0" w:color="000000"/>
             </w:tcBorders>
-            <w:shd w:val="clear" w:color="auto" w:fill="E7E6E6"/>
-            <w:tcMar>
-              <w:top w:w="30" w:type="dxa"/>
-              <w:left w:w="60" w:type="dxa"/>
-              <w:bottom w:w="30" w:type="dxa"/>
-              <w:right w:w="60" w:type="dxa"/>
-            </w:tcMar>
-          </w:tcPr>
-          <w:p>
-            <w:pPr>
+            <w:shd w:val="clear" w:color="auto" w:fill="auto"/>
+            <w:tcMar>
+              <w:top w:w="30" w:type="dxa"/>
+              <w:left w:w="60" w:type="dxa"/>
+              <w:bottom w:w="30" w:type="dxa"/>
+              <w:right w:w="60" w:type="dxa"/>
+            </w:tcMar>
+          </w:tcPr>
+          <w:p>
+            <w:pPr>
+              <w:keepNext/>
               <w:jc w:val="center"/>
             </w:pPr>
             <w:r>
@@ -1016,16 +1061,17 @@
               <w:bottom w:val="single" w:sz="4" w:space="0" w:color="000000"/>
               <w:right w:val="single" w:sz="4" w:space="0" w:color="000000"/>
             </w:tcBorders>
-            <w:shd w:val="clear" w:color="auto" w:fill="E7E6E6"/>
-            <w:tcMar>
-              <w:top w:w="30" w:type="dxa"/>
-              <w:left w:w="60" w:type="dxa"/>
-              <w:bottom w:w="30" w:type="dxa"/>
-              <w:right w:w="60" w:type="dxa"/>
-            </w:tcMar>
-          </w:tcPr>
-          <w:p>
-            <w:pPr>
+            <w:shd w:val="clear" w:color="auto" w:fill="auto"/>
+            <w:tcMar>
+              <w:top w:w="30" w:type="dxa"/>
+              <w:left w:w="60" w:type="dxa"/>
+              <w:bottom w:w="30" w:type="dxa"/>
+              <w:right w:w="60" w:type="dxa"/>
+            </w:tcMar>
+          </w:tcPr>
+          <w:p>
+            <w:pPr>
+              <w:keepNext/>
               <w:jc w:val="center"/>
             </w:pPr>
             <w:r>
@@ -1048,16 +1094,17 @@
               <w:bottom w:val="single" w:sz="4" w:space="0" w:color="000000"/>
               <w:right w:val="single" w:sz="4" w:space="0" w:color="000000"/>
             </w:tcBorders>
-            <w:shd w:val="clear" w:color="auto" w:fill="E7E6E6"/>
-            <w:tcMar>
-              <w:top w:w="30" w:type="dxa"/>
-              <w:left w:w="60" w:type="dxa"/>
-              <w:bottom w:w="30" w:type="dxa"/>
-              <w:right w:w="60" w:type="dxa"/>
-            </w:tcMar>
-          </w:tcPr>
-          <w:p>
-            <w:pPr>
+            <w:shd w:val="clear" w:color="auto" w:fill="auto"/>
+            <w:tcMar>
+              <w:top w:w="30" w:type="dxa"/>
+              <w:left w:w="60" w:type="dxa"/>
+              <w:bottom w:w="30" w:type="dxa"/>
+              <w:right w:w="60" w:type="dxa"/>
+            </w:tcMar>
+          </w:tcPr>
+          <w:p>
+            <w:pPr>
+              <w:keepNext/>
               <w:jc w:val="center"/>
             </w:pPr>
             <w:r>
@@ -1080,16 +1127,17 @@
               <w:bottom w:val="single" w:sz="4" w:space="0" w:color="000000"/>
               <w:right w:val="single" w:sz="4" w:space="0" w:color="000000"/>
             </w:tcBorders>
-            <w:shd w:val="clear" w:color="auto" w:fill="E7E6E6"/>
-            <w:tcMar>
-              <w:top w:w="30" w:type="dxa"/>
-              <w:left w:w="60" w:type="dxa"/>
-              <w:bottom w:w="30" w:type="dxa"/>
-              <w:right w:w="60" w:type="dxa"/>
-            </w:tcMar>
-          </w:tcPr>
-          <w:p>
-            <w:pPr>
+            <w:shd w:val="clear" w:color="auto" w:fill="auto"/>
+            <w:tcMar>
+              <w:top w:w="30" w:type="dxa"/>
+              <w:left w:w="60" w:type="dxa"/>
+              <w:bottom w:w="30" w:type="dxa"/>
+              <w:right w:w="60" w:type="dxa"/>
+            </w:tcMar>
+          </w:tcPr>
+          <w:p>
+            <w:pPr>
+              <w:keepNext/>
               <w:jc w:val="center"/>
             </w:pPr>
             <w:r>
@@ -1112,16 +1160,17 @@
               <w:bottom w:val="single" w:sz="4" w:space="0" w:color="000000"/>
               <w:right w:val="single" w:sz="4" w:space="0" w:color="000000"/>
             </w:tcBorders>
-            <w:shd w:val="clear" w:color="auto" w:fill="E7E6E6"/>
-            <w:tcMar>
-              <w:top w:w="30" w:type="dxa"/>
-              <w:left w:w="60" w:type="dxa"/>
-              <w:bottom w:w="30" w:type="dxa"/>
-              <w:right w:w="60" w:type="dxa"/>
-            </w:tcMar>
-          </w:tcPr>
-          <w:p>
-            <w:pPr>
+            <w:shd w:val="clear" w:color="auto" w:fill="auto"/>
+            <w:tcMar>
+              <w:top w:w="30" w:type="dxa"/>
+              <w:left w:w="60" w:type="dxa"/>
+              <w:bottom w:w="30" w:type="dxa"/>
+              <w:right w:w="60" w:type="dxa"/>
+            </w:tcMar>
+          </w:tcPr>
+          <w:p>
+            <w:pPr>
+              <w:keepNext/>
               <w:jc w:val="center"/>
             </w:pPr>
             <w:r>
@@ -1143,6 +1192,9 @@
             <w:bottom w:w="0" w:type="dxa"/>
           </w:tblCellMar>
         </w:tblPrEx>
+        <w:trPr>
+          <w:cantSplit/>
+        </w:trPr>
         <w:tc>
           <w:tcPr>
             <w:tcW w:w="460" w:type="dxa"/>
@@ -1161,6 +1213,7 @@
           </w:tcPr>
           <w:p>
             <w:pPr>
+              <w:keepNext/>
               <w:jc w:val="center"/>
             </w:pPr>
             <w:r>
@@ -1190,6 +1243,7 @@
           </w:tcPr>
           <w:p>
             <w:pPr>
+              <w:keepNext/>
               <w:jc w:val="center"/>
             </w:pPr>
             <w:r>
@@ -1219,6 +1273,7 @@
           </w:tcPr>
           <w:p>
             <w:pPr>
+              <w:keepNext/>
               <w:jc w:val="center"/>
             </w:pPr>
             <w:r>
@@ -1248,6 +1303,7 @@
           </w:tcPr>
           <w:p>
             <w:pPr>
+              <w:keepNext/>
               <w:jc w:val="center"/>
             </w:pPr>
             <w:r>
@@ -1277,6 +1333,7 @@
           </w:tcPr>
           <w:p>
             <w:pPr>
+              <w:keepNext/>
               <w:jc w:val="center"/>
             </w:pPr>
             <w:r>
@@ -1296,6 +1353,9 @@
             <w:bottom w:w="0" w:type="dxa"/>
           </w:tblCellMar>
         </w:tblPrEx>
+        <w:trPr>
+          <w:cantSplit/>
+        </w:trPr>
         <w:tc>
           <w:tcPr>
             <w:tcW w:w="460" w:type="dxa"/>
@@ -1314,6 +1374,7 @@
           </w:tcPr>
           <w:p>
             <w:pPr>
+              <w:keepNext/>
               <w:jc w:val="center"/>
             </w:pPr>
             <w:r>
@@ -1343,6 +1404,7 @@
           </w:tcPr>
           <w:p>
             <w:pPr>
+              <w:keepNext/>
               <w:jc w:val="center"/>
             </w:pPr>
             <w:r>
@@ -1372,6 +1434,7 @@
           </w:tcPr>
           <w:p>
             <w:pPr>
+              <w:keepNext/>
               <w:jc w:val="center"/>
             </w:pPr>
             <w:r>
@@ -1401,6 +1464,7 @@
           </w:tcPr>
           <w:p>
             <w:pPr>
+              <w:keepNext/>
               <w:jc w:val="center"/>
             </w:pPr>
             <w:r>
@@ -1430,6 +1494,7 @@
           </w:tcPr>
           <w:p>
             <w:pPr>
+              <w:keepNext/>
               <w:jc w:val="center"/>
             </w:pPr>
             <w:r>
@@ -1449,6 +1514,9 @@
             <w:bottom w:w="0" w:type="dxa"/>
           </w:tblCellMar>
         </w:tblPrEx>
+        <w:trPr>
+          <w:cantSplit/>
+        </w:trPr>
         <w:tc>
           <w:tcPr>
             <w:tcW w:w="460" w:type="dxa"/>
@@ -1467,6 +1535,7 @@
           </w:tcPr>
           <w:p>
             <w:pPr>
+              <w:keepNext/>
               <w:jc w:val="center"/>
             </w:pPr>
             <w:r>
@@ -1496,6 +1565,7 @@
           </w:tcPr>
           <w:p>
             <w:pPr>
+              <w:keepNext/>
               <w:jc w:val="center"/>
             </w:pPr>
             <w:r>
@@ -1525,6 +1595,7 @@
           </w:tcPr>
           <w:p>
             <w:pPr>
+              <w:keepNext/>
               <w:jc w:val="center"/>
             </w:pPr>
             <w:r>
@@ -1554,6 +1625,7 @@
           </w:tcPr>
           <w:p>
             <w:pPr>
+              <w:keepNext/>
               <w:jc w:val="center"/>
             </w:pPr>
             <w:r>
@@ -1583,6 +1655,7 @@
           </w:tcPr>
           <w:p>
             <w:pPr>
+              <w:keepNext/>
               <w:jc w:val="center"/>
             </w:pPr>
             <w:r>
@@ -1602,6 +1675,9 @@
             <w:bottom w:w="0" w:type="dxa"/>
           </w:tblCellMar>
         </w:tblPrEx>
+        <w:trPr>
+          <w:cantSplit/>
+        </w:trPr>
         <w:tc>
           <w:tcPr>
             <w:tcW w:w="460" w:type="dxa"/>
@@ -1620,6 +1696,7 @@
           </w:tcPr>
           <w:p>
             <w:pPr>
+              <w:keepNext/>
               <w:jc w:val="center"/>
             </w:pPr>
             <w:r>
@@ -1649,6 +1726,7 @@
           </w:tcPr>
           <w:p>
             <w:pPr>
+              <w:keepNext/>
               <w:jc w:val="center"/>
             </w:pPr>
             <w:r>
@@ -1678,6 +1756,7 @@
           </w:tcPr>
           <w:p>
             <w:pPr>
+              <w:keepNext/>
               <w:jc w:val="center"/>
             </w:pPr>
             <w:r>
@@ -1707,6 +1786,7 @@
           </w:tcPr>
           <w:p>
             <w:pPr>
+              <w:keepNext/>
               <w:jc w:val="center"/>
             </w:pPr>
             <w:r>
@@ -1736,6 +1816,7 @@
           </w:tcPr>
           <w:p>
             <w:pPr>
+              <w:keepNext/>
               <w:jc w:val="center"/>
             </w:pPr>
             <w:r>
@@ -1755,6 +1836,9 @@
             <w:bottom w:w="0" w:type="dxa"/>
           </w:tblCellMar>
         </w:tblPrEx>
+        <w:trPr>
+          <w:cantSplit/>
+        </w:trPr>
         <w:tc>
           <w:tcPr>
             <w:tcW w:w="460" w:type="dxa"/>
@@ -1773,6 +1857,7 @@
           </w:tcPr>
           <w:p>
             <w:pPr>
+              <w:keepNext/>
               <w:jc w:val="center"/>
             </w:pPr>
             <w:r>
@@ -1802,6 +1887,7 @@
           </w:tcPr>
           <w:p>
             <w:pPr>
+              <w:keepNext/>
               <w:jc w:val="center"/>
             </w:pPr>
             <w:r>
@@ -1831,6 +1917,7 @@
           </w:tcPr>
           <w:p>
             <w:pPr>
+              <w:keepNext/>
               <w:jc w:val="center"/>
             </w:pPr>
             <w:r>
@@ -1860,6 +1947,7 @@
           </w:tcPr>
           <w:p>
             <w:pPr>
+              <w:keepNext/>
               <w:jc w:val="center"/>
             </w:pPr>
             <w:r>
@@ -1889,6 +1977,7 @@
           </w:tcPr>
           <w:p>
             <w:pPr>
+              <w:keepNext/>
               <w:jc w:val="center"/>
             </w:pPr>
             <w:r>
@@ -1908,6 +1997,9 @@
             <w:bottom w:w="0" w:type="dxa"/>
           </w:tblCellMar>
         </w:tblPrEx>
+        <w:trPr>
+          <w:cantSplit/>
+        </w:trPr>
         <w:tc>
           <w:tcPr>
             <w:tcW w:w="460" w:type="dxa"/>
@@ -1926,6 +2018,7 @@
           </w:tcPr>
           <w:p>
             <w:pPr>
+              <w:keepNext/>
               <w:jc w:val="center"/>
             </w:pPr>
             <w:r>
@@ -1955,6 +2048,7 @@
           </w:tcPr>
           <w:p>
             <w:pPr>
+              <w:keepNext/>
               <w:jc w:val="center"/>
             </w:pPr>
             <w:r>
@@ -1984,6 +2078,7 @@
           </w:tcPr>
           <w:p>
             <w:pPr>
+              <w:keepNext/>
               <w:jc w:val="center"/>
             </w:pPr>
             <w:r>
@@ -2013,6 +2108,7 @@
           </w:tcPr>
           <w:p>
             <w:pPr>
+              <w:keepNext/>
               <w:jc w:val="center"/>
             </w:pPr>
             <w:r>
@@ -2042,6 +2138,7 @@
           </w:tcPr>
           <w:p>
             <w:pPr>
+              <w:keepNext/>
               <w:jc w:val="center"/>
             </w:pPr>
             <w:r>
@@ -2061,6 +2158,9 @@
             <w:bottom w:w="0" w:type="dxa"/>
           </w:tblCellMar>
         </w:tblPrEx>
+        <w:trPr>
+          <w:cantSplit/>
+        </w:trPr>
         <w:tc>
           <w:tcPr>
             <w:tcW w:w="460" w:type="dxa"/>
@@ -2079,6 +2179,7 @@
           </w:tcPr>
           <w:p>
             <w:pPr>
+              <w:keepNext/>
               <w:jc w:val="center"/>
             </w:pPr>
             <w:r>
@@ -2108,6 +2209,7 @@
           </w:tcPr>
           <w:p>
             <w:pPr>
+              <w:keepNext/>
               <w:jc w:val="center"/>
             </w:pPr>
             <w:r>
@@ -2137,6 +2239,7 @@
           </w:tcPr>
           <w:p>
             <w:pPr>
+              <w:keepNext/>
               <w:jc w:val="center"/>
             </w:pPr>
             <w:r>
@@ -2166,6 +2269,7 @@
           </w:tcPr>
           <w:p>
             <w:pPr>
+              <w:keepNext/>
               <w:jc w:val="center"/>
             </w:pPr>
             <w:r>
@@ -2195,6 +2299,7 @@
           </w:tcPr>
           <w:p>
             <w:pPr>
+              <w:keepNext/>
               <w:jc w:val="center"/>
             </w:pPr>
             <w:r>
@@ -2214,6 +2319,9 @@
             <w:bottom w:w="0" w:type="dxa"/>
           </w:tblCellMar>
         </w:tblPrEx>
+        <w:trPr>
+          <w:cantSplit/>
+        </w:trPr>
         <w:tc>
           <w:tcPr>
             <w:tcW w:w="460" w:type="dxa"/>
@@ -2232,6 +2340,7 @@
           </w:tcPr>
           <w:p>
             <w:pPr>
+              <w:keepNext/>
               <w:jc w:val="center"/>
             </w:pPr>
             <w:r>
@@ -2261,6 +2370,7 @@
           </w:tcPr>
           <w:p>
             <w:pPr>
+              <w:keepNext/>
               <w:jc w:val="center"/>
             </w:pPr>
             <w:r>
@@ -2290,6 +2400,7 @@
           </w:tcPr>
           <w:p>
             <w:pPr>
+              <w:keepNext/>
               <w:jc w:val="center"/>
             </w:pPr>
             <w:r>
@@ -2319,6 +2430,7 @@
           </w:tcPr>
           <w:p>
             <w:pPr>
+              <w:keepNext/>
               <w:jc w:val="center"/>
             </w:pPr>
             <w:r>
@@ -2348,6 +2460,7 @@
           </w:tcPr>
           <w:p>
             <w:pPr>
+              <w:keepNext/>
               <w:jc w:val="center"/>
             </w:pPr>
             <w:r>
@@ -2367,6 +2480,9 @@
             <w:bottom w:w="0" w:type="dxa"/>
           </w:tblCellMar>
         </w:tblPrEx>
+        <w:trPr>
+          <w:cantSplit/>
+        </w:trPr>
         <w:tc>
           <w:tcPr>
             <w:tcW w:w="460" w:type="dxa"/>
@@ -2385,6 +2501,7 @@
           </w:tcPr>
           <w:p>
             <w:pPr>
+              <w:keepNext/>
               <w:jc w:val="center"/>
             </w:pPr>
             <w:r>
@@ -2414,6 +2531,7 @@
           </w:tcPr>
           <w:p>
             <w:pPr>
+              <w:keepNext/>
               <w:jc w:val="center"/>
             </w:pPr>
             <w:r>
@@ -2443,6 +2561,7 @@
           </w:tcPr>
           <w:p>
             <w:pPr>
+              <w:keepNext/>
               <w:jc w:val="center"/>
             </w:pPr>
             <w:r>
@@ -2472,6 +2591,7 @@
           </w:tcPr>
           <w:p>
             <w:pPr>
+              <w:keepNext/>
               <w:jc w:val="center"/>
             </w:pPr>
             <w:r>
@@ -2501,6 +2621,7 @@
           </w:tcPr>
           <w:p>
             <w:pPr>
+              <w:keepNext/>
               <w:jc w:val="center"/>
             </w:pPr>
             <w:r>
@@ -2520,6 +2641,9 @@
             <w:bottom w:w="0" w:type="dxa"/>
           </w:tblCellMar>
         </w:tblPrEx>
+        <w:trPr>
+          <w:cantSplit/>
+        </w:trPr>
         <w:tc>
           <w:tcPr>
             <w:tcW w:w="460" w:type="dxa"/>
@@ -2538,6 +2662,7 @@
           </w:tcPr>
           <w:p>
             <w:pPr>
+              <w:keepNext/>
               <w:jc w:val="center"/>
             </w:pPr>
             <w:r>
@@ -2567,6 +2692,7 @@
           </w:tcPr>
           <w:p>
             <w:pPr>
+              <w:keepNext/>
               <w:jc w:val="center"/>
             </w:pPr>
             <w:r>
@@ -2596,6 +2722,7 @@
           </w:tcPr>
           <w:p>
             <w:pPr>
+              <w:keepNext/>
               <w:jc w:val="center"/>
             </w:pPr>
             <w:r>
@@ -2625,6 +2752,7 @@
           </w:tcPr>
           <w:p>
             <w:pPr>
+              <w:keepNext/>
               <w:jc w:val="center"/>
             </w:pPr>
             <w:r>
@@ -2654,6 +2782,7 @@
           </w:tcPr>
           <w:p>
             <w:pPr>
+              <w:keepNext/>
               <w:jc w:val="center"/>
             </w:pPr>
             <w:r>
@@ -2673,6 +2802,9 @@
             <w:bottom w:w="0" w:type="dxa"/>
           </w:tblCellMar>
         </w:tblPrEx>
+        <w:trPr>
+          <w:cantSplit/>
+        </w:trPr>
         <w:tc>
           <w:tcPr>
             <w:tcW w:w="460" w:type="dxa"/>
@@ -2691,6 +2823,7 @@
           </w:tcPr>
           <w:p>
             <w:pPr>
+              <w:keepNext/>
               <w:jc w:val="center"/>
             </w:pPr>
             <w:r>
@@ -2720,6 +2853,7 @@
           </w:tcPr>
           <w:p>
             <w:pPr>
+              <w:keepNext/>
               <w:jc w:val="center"/>
             </w:pPr>
             <w:r>
@@ -2749,6 +2883,7 @@
           </w:tcPr>
           <w:p>
             <w:pPr>
+              <w:keepNext/>
               <w:jc w:val="center"/>
             </w:pPr>
             <w:r>
@@ -2778,6 +2913,7 @@
           </w:tcPr>
           <w:p>
             <w:pPr>
+              <w:keepNext/>
               <w:jc w:val="center"/>
             </w:pPr>
             <w:r>
@@ -2807,6 +2943,7 @@
           </w:tcPr>
           <w:p>
             <w:pPr>
+              <w:keepNext/>
               <w:jc w:val="center"/>
             </w:pPr>
             <w:r>
@@ -2826,6 +2963,9 @@
             <w:bottom w:w="0" w:type="dxa"/>
           </w:tblCellMar>
         </w:tblPrEx>
+        <w:trPr>
+          <w:cantSplit/>
+        </w:trPr>
         <w:tc>
           <w:tcPr>
             <w:tcW w:w="460" w:type="dxa"/>
@@ -3606,6 +3746,16 @@
     </w:p>
     <w:p>
       <w:pPr>
+        <w:spacing w:after="100"/>
+        <w:ind w:firstLine="202"/>
+        <w:jc w:val="both"/>
+      </w:pPr>
+      <w:r>
+        <w:t>Table II lists the seven measurements E1 to E7 with the result, the number of samples and the outcome of each. Fig. 2 compares CGPA cut-off screening with the proposed multi-criteria classification over the same 660,000 student-company decisions, and Fig. 3 shows how one decision and its reasons appear to a student in the deployed application.</w:t>
+      </w:r>
+    </w:p>
+    <w:p>
+      <w:pPr>
         <w:keepNext/>
         <w:spacing w:before="100"/>
         <w:jc w:val="center"/>
@@ -3666,6 +3816,7 @@
           </w:tblCellMar>
         </w:tblPrEx>
         <w:trPr>
+          <w:cantSplit/>
           <w:tblHeader/>
         </w:trPr>
         <w:tc>
@@ -3677,16 +3828,17 @@
               <w:bottom w:val="single" w:sz="4" w:space="0" w:color="000000"/>
               <w:right w:val="single" w:sz="4" w:space="0" w:color="000000"/>
             </w:tcBorders>
-            <w:shd w:val="clear" w:color="auto" w:fill="E7E6E6"/>
-            <w:tcMar>
-              <w:top w:w="30" w:type="dxa"/>
-              <w:left w:w="60" w:type="dxa"/>
-              <w:bottom w:w="30" w:type="dxa"/>
-              <w:right w:w="60" w:type="dxa"/>
-            </w:tcMar>
-          </w:tcPr>
-          <w:p>
-            <w:pPr>
+            <w:shd w:val="clear" w:color="auto" w:fill="auto"/>
+            <w:tcMar>
+              <w:top w:w="30" w:type="dxa"/>
+              <w:left w:w="60" w:type="dxa"/>
+              <w:bottom w:w="30" w:type="dxa"/>
+              <w:right w:w="60" w:type="dxa"/>
+            </w:tcMar>
+          </w:tcPr>
+          <w:p>
+            <w:pPr>
+              <w:keepNext/>
               <w:jc w:val="center"/>
             </w:pPr>
             <w:r>
@@ -3709,16 +3861,17 @@
               <w:bottom w:val="single" w:sz="4" w:space="0" w:color="000000"/>
               <w:right w:val="single" w:sz="4" w:space="0" w:color="000000"/>
             </w:tcBorders>
-            <w:shd w:val="clear" w:color="auto" w:fill="E7E6E6"/>
-            <w:tcMar>
-              <w:top w:w="30" w:type="dxa"/>
-              <w:left w:w="60" w:type="dxa"/>
-              <w:bottom w:w="30" w:type="dxa"/>
-              <w:right w:w="60" w:type="dxa"/>
-            </w:tcMar>
-          </w:tcPr>
-          <w:p>
-            <w:pPr>
+            <w:shd w:val="clear" w:color="auto" w:fill="auto"/>
+            <w:tcMar>
+              <w:top w:w="30" w:type="dxa"/>
+              <w:left w:w="60" w:type="dxa"/>
+              <w:bottom w:w="30" w:type="dxa"/>
+              <w:right w:w="60" w:type="dxa"/>
+            </w:tcMar>
+          </w:tcPr>
+          <w:p>
+            <w:pPr>
+              <w:keepNext/>
               <w:jc w:val="center"/>
             </w:pPr>
             <w:r>
@@ -3741,16 +3894,17 @@
               <w:bottom w:val="single" w:sz="4" w:space="0" w:color="000000"/>
               <w:right w:val="single" w:sz="4" w:space="0" w:color="000000"/>
             </w:tcBorders>
-            <w:shd w:val="clear" w:color="auto" w:fill="E7E6E6"/>
-            <w:tcMar>
-              <w:top w:w="30" w:type="dxa"/>
-              <w:left w:w="60" w:type="dxa"/>
-              <w:bottom w:w="30" w:type="dxa"/>
-              <w:right w:w="60" w:type="dxa"/>
-            </w:tcMar>
-          </w:tcPr>
-          <w:p>
-            <w:pPr>
+            <w:shd w:val="clear" w:color="auto" w:fill="auto"/>
+            <w:tcMar>
+              <w:top w:w="30" w:type="dxa"/>
+              <w:left w:w="60" w:type="dxa"/>
+              <w:bottom w:w="30" w:type="dxa"/>
+              <w:right w:w="60" w:type="dxa"/>
+            </w:tcMar>
+          </w:tcPr>
+          <w:p>
+            <w:pPr>
+              <w:keepNext/>
               <w:jc w:val="center"/>
             </w:pPr>
             <w:r>
@@ -3773,16 +3927,17 @@
               <w:bottom w:val="single" w:sz="4" w:space="0" w:color="000000"/>
               <w:right w:val="single" w:sz="4" w:space="0" w:color="000000"/>
             </w:tcBorders>
-            <w:shd w:val="clear" w:color="auto" w:fill="E7E6E6"/>
-            <w:tcMar>
-              <w:top w:w="30" w:type="dxa"/>
-              <w:left w:w="60" w:type="dxa"/>
-              <w:bottom w:w="30" w:type="dxa"/>
-              <w:right w:w="60" w:type="dxa"/>
-            </w:tcMar>
-          </w:tcPr>
-          <w:p>
-            <w:pPr>
+            <w:shd w:val="clear" w:color="auto" w:fill="auto"/>
+            <w:tcMar>
+              <w:top w:w="30" w:type="dxa"/>
+              <w:left w:w="60" w:type="dxa"/>
+              <w:bottom w:w="30" w:type="dxa"/>
+              <w:right w:w="60" w:type="dxa"/>
+            </w:tcMar>
+          </w:tcPr>
+          <w:p>
+            <w:pPr>
+              <w:keepNext/>
               <w:jc w:val="center"/>
             </w:pPr>
             <w:r>
@@ -3805,16 +3960,17 @@
               <w:bottom w:val="single" w:sz="4" w:space="0" w:color="000000"/>
               <w:right w:val="single" w:sz="4" w:space="0" w:color="000000"/>
             </w:tcBorders>
-            <w:shd w:val="clear" w:color="auto" w:fill="E7E6E6"/>
-            <w:tcMar>
-              <w:top w:w="30" w:type="dxa"/>
-              <w:left w:w="60" w:type="dxa"/>
-              <w:bottom w:w="30" w:type="dxa"/>
-              <w:right w:w="60" w:type="dxa"/>
-            </w:tcMar>
-          </w:tcPr>
-          <w:p>
-            <w:pPr>
+            <w:shd w:val="clear" w:color="auto" w:fill="auto"/>
+            <w:tcMar>
+              <w:top w:w="30" w:type="dxa"/>
+              <w:left w:w="60" w:type="dxa"/>
+              <w:bottom w:w="30" w:type="dxa"/>
+              <w:right w:w="60" w:type="dxa"/>
+            </w:tcMar>
+          </w:tcPr>
+          <w:p>
+            <w:pPr>
+              <w:keepNext/>
               <w:jc w:val="center"/>
             </w:pPr>
             <w:r>
@@ -3836,6 +3992,9 @@
             <w:bottom w:w="0" w:type="dxa"/>
           </w:tblCellMar>
         </w:tblPrEx>
+        <w:trPr>
+          <w:cantSplit/>
+        </w:trPr>
         <w:tc>
           <w:tcPr>
             <w:tcW w:w="420" w:type="dxa"/>
@@ -3854,6 +4013,7 @@
           </w:tcPr>
           <w:p>
             <w:pPr>
+              <w:keepNext/>
               <w:jc w:val="center"/>
             </w:pPr>
             <w:r>
@@ -3883,6 +4043,7 @@
           </w:tcPr>
           <w:p>
             <w:pPr>
+              <w:keepNext/>
               <w:jc w:val="center"/>
             </w:pPr>
             <w:r>
@@ -3914,6 +4075,7 @@
           </w:tcPr>
           <w:p>
             <w:pPr>
+              <w:keepNext/>
               <w:jc w:val="center"/>
             </w:pPr>
             <w:r>
@@ -3945,6 +4107,7 @@
           </w:tcPr>
           <w:p>
             <w:pPr>
+              <w:keepNext/>
               <w:jc w:val="center"/>
             </w:pPr>
             <w:r>
@@ -3976,6 +4139,7 @@
           </w:tcPr>
           <w:p>
             <w:pPr>
+              <w:keepNext/>
               <w:jc w:val="center"/>
             </w:pPr>
             <w:r>
@@ -3997,6 +4161,9 @@
             <w:bottom w:w="0" w:type="dxa"/>
           </w:tblCellMar>
         </w:tblPrEx>
+        <w:trPr>
+          <w:cantSplit/>
+        </w:trPr>
         <w:tc>
           <w:tcPr>
             <w:tcW w:w="420" w:type="dxa"/>
@@ -4015,6 +4182,7 @@
           </w:tcPr>
           <w:p>
             <w:pPr>
+              <w:keepNext/>
               <w:jc w:val="center"/>
             </w:pPr>
             <w:r>
@@ -4044,6 +4212,7 @@
           </w:tcPr>
           <w:p>
             <w:pPr>
+              <w:keepNext/>
               <w:jc w:val="center"/>
             </w:pPr>
             <w:r>
@@ -4075,6 +4244,7 @@
           </w:tcPr>
           <w:p>
             <w:pPr>
+              <w:keepNext/>
               <w:jc w:val="center"/>
             </w:pPr>
             <w:r>
@@ -4106,6 +4276,7 @@
           </w:tcPr>
           <w:p>
             <w:pPr>
+              <w:keepNext/>
               <w:jc w:val="center"/>
             </w:pPr>
             <w:r>
@@ -4137,6 +4308,7 @@
           </w:tcPr>
           <w:p>
             <w:pPr>
+              <w:keepNext/>
               <w:jc w:val="center"/>
             </w:pPr>
             <w:r>
@@ -4158,6 +4330,9 @@
             <w:bottom w:w="0" w:type="dxa"/>
           </w:tblCellMar>
         </w:tblPrEx>
+        <w:trPr>
+          <w:cantSplit/>
+        </w:trPr>
         <w:tc>
           <w:tcPr>
             <w:tcW w:w="420" w:type="dxa"/>
@@ -4176,6 +4351,7 @@
           </w:tcPr>
           <w:p>
             <w:pPr>
+              <w:keepNext/>
               <w:jc w:val="center"/>
             </w:pPr>
             <w:r>
@@ -4205,6 +4381,7 @@
           </w:tcPr>
           <w:p>
             <w:pPr>
+              <w:keepNext/>
               <w:jc w:val="center"/>
             </w:pPr>
             <w:r>
@@ -4236,6 +4413,7 @@
           </w:tcPr>
           <w:p>
             <w:pPr>
+              <w:keepNext/>
               <w:jc w:val="center"/>
             </w:pPr>
             <w:r>
@@ -4267,6 +4445,7 @@
           </w:tcPr>
           <w:p>
             <w:pPr>
+              <w:keepNext/>
               <w:jc w:val="center"/>
             </w:pPr>
             <w:r>
@@ -4298,6 +4477,7 @@
           </w:tcPr>
           <w:p>
             <w:pPr>
+              <w:keepNext/>
               <w:jc w:val="center"/>
             </w:pPr>
             <w:r>
@@ -4319,6 +4499,9 @@
             <w:bottom w:w="0" w:type="dxa"/>
           </w:tblCellMar>
         </w:tblPrEx>
+        <w:trPr>
+          <w:cantSplit/>
+        </w:trPr>
         <w:tc>
           <w:tcPr>
             <w:tcW w:w="420" w:type="dxa"/>
@@ -4337,6 +4520,7 @@
           </w:tcPr>
           <w:p>
             <w:pPr>
+              <w:keepNext/>
               <w:jc w:val="center"/>
             </w:pPr>
             <w:r>
@@ -4366,6 +4550,7 @@
           </w:tcPr>
           <w:p>
             <w:pPr>
+              <w:keepNext/>
               <w:jc w:val="center"/>
             </w:pPr>
             <w:r>
@@ -4397,6 +4582,7 @@
           </w:tcPr>
           <w:p>
             <w:pPr>
+              <w:keepNext/>
               <w:jc w:val="center"/>
             </w:pPr>
             <w:r>
@@ -4428,6 +4614,7 @@
           </w:tcPr>
           <w:p>
             <w:pPr>
+              <w:keepNext/>
               <w:jc w:val="center"/>
             </w:pPr>
             <w:r>
@@ -4459,6 +4646,7 @@
           </w:tcPr>
           <w:p>
             <w:pPr>
+              <w:keepNext/>
               <w:jc w:val="center"/>
             </w:pPr>
             <w:r>
@@ -4480,6 +4668,9 @@
             <w:bottom w:w="0" w:type="dxa"/>
           </w:tblCellMar>
         </w:tblPrEx>
+        <w:trPr>
+          <w:cantSplit/>
+        </w:trPr>
         <w:tc>
           <w:tcPr>
             <w:tcW w:w="420" w:type="dxa"/>
@@ -4498,6 +4689,7 @@
           </w:tcPr>
           <w:p>
             <w:pPr>
+              <w:keepNext/>
               <w:jc w:val="center"/>
             </w:pPr>
             <w:r>
@@ -4527,6 +4719,7 @@
           </w:tcPr>
           <w:p>
             <w:pPr>
+              <w:keepNext/>
               <w:jc w:val="center"/>
             </w:pPr>
             <w:r>
@@ -4558,6 +4751,7 @@
           </w:tcPr>
           <w:p>
             <w:pPr>
+              <w:keepNext/>
               <w:jc w:val="center"/>
             </w:pPr>
             <w:r>
@@ -4589,6 +4783,7 @@
           </w:tcPr>
           <w:p>
             <w:pPr>
+              <w:keepNext/>
               <w:jc w:val="center"/>
             </w:pPr>
             <w:r>
@@ -4620,6 +4815,7 @@
           </w:tcPr>
           <w:p>
             <w:pPr>
+              <w:keepNext/>
               <w:jc w:val="center"/>
             </w:pPr>
             <w:r>
@@ -4641,6 +4837,9 @@
             <w:bottom w:w="0" w:type="dxa"/>
           </w:tblCellMar>
         </w:tblPrEx>
+        <w:trPr>
+          <w:cantSplit/>
+        </w:trPr>
         <w:tc>
           <w:tcPr>
             <w:tcW w:w="420" w:type="dxa"/>
@@ -4659,6 +4858,7 @@
           </w:tcPr>
           <w:p>
             <w:pPr>
+              <w:keepNext/>
               <w:jc w:val="center"/>
             </w:pPr>
             <w:r>
@@ -4688,6 +4888,7 @@
           </w:tcPr>
           <w:p>
             <w:pPr>
+              <w:keepNext/>
               <w:jc w:val="center"/>
             </w:pPr>
             <w:r>
@@ -4719,6 +4920,7 @@
           </w:tcPr>
           <w:p>
             <w:pPr>
+              <w:keepNext/>
               <w:jc w:val="center"/>
             </w:pPr>
             <w:r>
@@ -4750,6 +4952,7 @@
           </w:tcPr>
           <w:p>
             <w:pPr>
+              <w:keepNext/>
               <w:jc w:val="center"/>
             </w:pPr>
             <w:r>
@@ -4781,6 +4984,7 @@
           </w:tcPr>
           <w:p>
             <w:pPr>
+              <w:keepNext/>
               <w:jc w:val="center"/>
             </w:pPr>
             <w:r>
@@ -4802,6 +5006,9 @@
             <w:bottom w:w="0" w:type="dxa"/>
           </w:tblCellMar>
         </w:tblPrEx>
+        <w:trPr>
+          <w:cantSplit/>
+        </w:trPr>
         <w:tc>
           <w:tcPr>
             <w:tcW w:w="420" w:type="dxa"/>
@@ -5314,7 +5521,7 @@
           <w:sz w:val="16"/>
           <w:szCs w:val="16"/>
         </w:rPr>
-        <w:t>, Bengaluru, India, 2023, pp. 1-6, doi: 10.1109/CSITSS60515.2023.10334118.</w:t>
+        <w:t>, Bengaluru, India, Nov. 2023, pp. 1-6, doi: 10.1109/CSITSS60515.2023.10334118.</w:t>
       </w:r>
       <w:proofErr w:type="spellStart"/>
       <w:proofErr w:type="spellEnd"/>
@@ -5564,7 +5771,7 @@
           <w:sz w:val="16"/>
           <w:szCs w:val="16"/>
         </w:rPr>
-        <w:t>, vol. 56, no. 10, pp. 1-33, 2024, doi: 10.1145/3659942.</w:t>
+        <w:t>, vol. 56, no. 10, pp. 1-33, Oct. 2024, doi: 10.1145/3659942.</w:t>
       </w:r>
       <w:proofErr w:type="spellStart"/>
       <w:proofErr w:type="spellEnd"/>
@@ -5707,14 +5914,14 @@
           <w:sz w:val="16"/>
           <w:szCs w:val="16"/>
         </w:rPr>
-        <w:t>Lecture Notes on Data Engineering and Communications Technologies</w:t>
-      </w:r>
-      <w:r>
-        <w:rPr>
-          <w:sz w:val="16"/>
-          <w:szCs w:val="16"/>
-        </w:rPr>
-        <w:t>. Singapore: Springer, 2025, pp. 17-33, doi: 10.1007/978-981-97-9255-9_2.</w:t>
+        <w:t>Artificial Intelligence in Education Technologies: New Development and Innovative Practices</w:t>
+      </w:r>
+      <w:r>
+        <w:rPr>
+          <w:sz w:val="16"/>
+          <w:szCs w:val="16"/>
+        </w:rPr>
+        <w:t xml:space="preserve"> (Lecture Notes on Data Engineering and Communications Technologies), T. Schlippe, E. C. K. Cheng, and T. Wang, Eds. Singapore: Springer, 2025, pp. 17-33, doi: 10.1007/978-981-97-9255-9_2.</w:t>
       </w:r>
       <w:proofErr w:type="spellStart"/>
       <w:proofErr w:type="spellEnd"/>
@@ -5864,7 +6071,7 @@
           <w:sz w:val="16"/>
           <w:szCs w:val="16"/>
         </w:rPr>
-        <w:t>, 2023, pp. 453-458, doi: 10.1109/UBMK59864.2023.10286605.</w:t>
+        <w:t>, Burdur, Türkiye, Sep. 2023, pp. 453-458, doi: 10.1109/UBMK59864.2023.10286605.</w:t>
       </w:r>
       <w:proofErr w:type="spellStart"/>
       <w:proofErr w:type="spellEnd"/>
@@ -6249,7 +6456,7 @@
           <w:sz w:val="16"/>
           <w:szCs w:val="16"/>
         </w:rPr>
-        <w:t>:2508.10925, Aug. 2025.</w:t>
+        <w:t>:2508.10925, Aug. 2025, doi: 10.48550/arXiv.2508.10925.</w:t>
       </w:r>
       <w:proofErr w:type="spellStart"/>
       <w:proofErr w:type="spellEnd"/>

</xml_diff>